<commit_message>
M2M Transfers Config Worksheet
Updated config worksheet
</commit_message>
<xml_diff>
--- a/m2m-transfers/M2M Transfers Config Worksheet.docx
+++ b/m2m-transfers/M2M Transfers Config Worksheet.docx
@@ -80,7 +80,21 @@
           <w:sz w:val="24"/>
           <w:szCs w:val="24"/>
         </w:rPr>
-        <w:t>M2MTRANSFERS.V3.</w:t>
+        <w:t>M2MTRANSFERS.V</w:t>
+      </w:r>
+      <w:r>
+        <w:rPr>
+          <w:sz w:val="24"/>
+          <w:szCs w:val="24"/>
+        </w:rPr>
+        <w:t>4</w:t>
+      </w:r>
+      <w:r>
+        <w:rPr>
+          <w:sz w:val="24"/>
+          <w:szCs w:val="24"/>
+        </w:rPr>
+        <w:t>.</w:t>
       </w:r>
       <w:r>
         <w:rPr>
@@ -308,8 +322,16 @@
               <w:rPr>
                 <w:color w:val="000000" w:themeColor="text1"/>
               </w:rPr>
-              <w:t xml:space="preserve"> Yes or No</w:t>
-            </w:r>
+              <w:t xml:space="preserve"> Yes or </w:t>
+            </w:r>
+            <w:proofErr w:type="gramStart"/>
+            <w:r>
+              <w:rPr>
+                <w:color w:val="000000" w:themeColor="text1"/>
+              </w:rPr>
+              <w:t>No</w:t>
+            </w:r>
+            <w:proofErr w:type="gramEnd"/>
           </w:p>
         </w:tc>
         <w:tc>
@@ -488,6 +510,257 @@
         <w:ind w:left="0"/>
       </w:pPr>
       <w:r>
+        <w:t>Spanish Language Support</w:t>
+      </w:r>
+    </w:p>
+    <w:p>
+      <w:pPr>
+        <w:rPr>
+          <w:b/>
+          <w:bCs/>
+        </w:rPr>
+      </w:pPr>
+      <w:r>
+        <w:rPr>
+          <w:b/>
+          <w:bCs/>
+        </w:rPr>
+        <w:t xml:space="preserve">This </w:t>
+      </w:r>
+      <w:r>
+        <w:rPr>
+          <w:b/>
+          <w:bCs/>
+        </w:rPr>
+        <w:t xml:space="preserve">parameter is only used if the Credit Union is </w:t>
+      </w:r>
+      <w:r>
+        <w:rPr>
+          <w:b/>
+          <w:bCs/>
+          <w:u w:val="single"/>
+        </w:rPr>
+        <w:t>contracted</w:t>
+      </w:r>
+      <w:r>
+        <w:rPr>
+          <w:b/>
+          <w:bCs/>
+        </w:rPr>
+        <w:t xml:space="preserve"> for Banno Spanish Languag</w:t>
+      </w:r>
+      <w:r>
+        <w:rPr>
+          <w:b/>
+          <w:bCs/>
+        </w:rPr>
+        <w:t>e Support.</w:t>
+      </w:r>
+    </w:p>
+    <w:tbl>
+      <w:tblPr>
+        <w:tblStyle w:val="TableGrid"/>
+        <w:tblW w:w="0" w:type="auto"/>
+        <w:tblLook w:val="04A0" w:firstRow="1" w:lastRow="0" w:firstColumn="1" w:lastColumn="0" w:noHBand="0" w:noVBand="1"/>
+      </w:tblPr>
+      <w:tblGrid>
+        <w:gridCol w:w="2697"/>
+        <w:gridCol w:w="3508"/>
+        <w:gridCol w:w="2070"/>
+        <w:gridCol w:w="2515"/>
+      </w:tblGrid>
+      <w:tr>
+        <w:tc>
+          <w:tcPr>
+            <w:tcW w:w="2697" w:type="dxa"/>
+          </w:tcPr>
+          <w:p>
+            <w:pPr>
+              <w:jc w:val="center"/>
+              <w:rPr>
+                <w:b/>
+                <w:bCs/>
+              </w:rPr>
+            </w:pPr>
+            <w:r>
+              <w:rPr>
+                <w:b/>
+                <w:bCs/>
+              </w:rPr>
+              <w:t>Parameter Name</w:t>
+            </w:r>
+          </w:p>
+        </w:tc>
+        <w:tc>
+          <w:tcPr>
+            <w:tcW w:w="3508" w:type="dxa"/>
+          </w:tcPr>
+          <w:p>
+            <w:pPr>
+              <w:jc w:val="center"/>
+              <w:rPr>
+                <w:b/>
+                <w:bCs/>
+              </w:rPr>
+            </w:pPr>
+            <w:r>
+              <w:rPr>
+                <w:b/>
+                <w:bCs/>
+              </w:rPr>
+              <w:t>Parameter Description</w:t>
+            </w:r>
+          </w:p>
+        </w:tc>
+        <w:tc>
+          <w:tcPr>
+            <w:tcW w:w="2070" w:type="dxa"/>
+          </w:tcPr>
+          <w:p>
+            <w:pPr>
+              <w:jc w:val="center"/>
+              <w:rPr>
+                <w:b/>
+                <w:bCs/>
+              </w:rPr>
+            </w:pPr>
+            <w:r>
+              <w:rPr>
+                <w:b/>
+                <w:bCs/>
+              </w:rPr>
+              <w:t>Default Value</w:t>
+            </w:r>
+          </w:p>
+        </w:tc>
+        <w:tc>
+          <w:tcPr>
+            <w:tcW w:w="2515" w:type="dxa"/>
+          </w:tcPr>
+          <w:p>
+            <w:pPr>
+              <w:jc w:val="center"/>
+              <w:rPr>
+                <w:b/>
+                <w:bCs/>
+              </w:rPr>
+            </w:pPr>
+            <w:r>
+              <w:rPr>
+                <w:b/>
+                <w:bCs/>
+              </w:rPr>
+              <w:t>CU Response</w:t>
+            </w:r>
+          </w:p>
+        </w:tc>
+      </w:tr>
+      <w:tr>
+        <w:tc>
+          <w:tcPr>
+            <w:tcW w:w="2697" w:type="dxa"/>
+          </w:tcPr>
+          <w:p>
+            <w:r>
+              <w:t>Spanish Language Support</w:t>
+            </w:r>
+          </w:p>
+        </w:tc>
+        <w:tc>
+          <w:tcPr>
+            <w:tcW w:w="3508" w:type="dxa"/>
+          </w:tcPr>
+          <w:p>
+            <w:r>
+              <w:t xml:space="preserve">Set the Spanish Language Support parameter to TRUE if Spanish versions of soft text and error messages should be displayed </w:t>
+            </w:r>
+            <w:r>
+              <w:t>to the user</w:t>
+            </w:r>
+            <w:r>
+              <w:t xml:space="preserve"> when a Spanish supported browser</w:t>
+            </w:r>
+            <w:r>
+              <w:t>/device</w:t>
+            </w:r>
+            <w:r>
+              <w:t xml:space="preserve"> is being used.</w:t>
+            </w:r>
+            <w:r>
+              <w:t xml:space="preserve"> </w:t>
+            </w:r>
+          </w:p>
+          <w:p/>
+          <w:p>
+            <w:r>
+              <w:rPr>
+                <w:b/>
+                <w:bCs/>
+              </w:rPr>
+              <w:t>Valid Values:</w:t>
+            </w:r>
+            <w:r>
+              <w:t xml:space="preserve"> TRUE or FALSE</w:t>
+            </w:r>
+          </w:p>
+        </w:tc>
+        <w:tc>
+          <w:tcPr>
+            <w:tcW w:w="2070" w:type="dxa"/>
+          </w:tcPr>
+          <w:p>
+            <w:pPr>
+              <w:jc w:val="center"/>
+            </w:pPr>
+          </w:p>
+          <w:p>
+            <w:pPr>
+              <w:jc w:val="center"/>
+            </w:pPr>
+          </w:p>
+          <w:p>
+            <w:pPr>
+              <w:jc w:val="center"/>
+            </w:pPr>
+          </w:p>
+          <w:p>
+            <w:pPr>
+              <w:jc w:val="center"/>
+            </w:pPr>
+            <w:r>
+              <w:t>SLS: FALSE</w:t>
+            </w:r>
+          </w:p>
+        </w:tc>
+        <w:tc>
+          <w:tcPr>
+            <w:tcW w:w="2515" w:type="dxa"/>
+          </w:tcPr>
+          <w:p>
+            <w:pPr>
+              <w:jc w:val="center"/>
+            </w:pPr>
+          </w:p>
+          <w:p>
+            <w:pPr>
+              <w:jc w:val="center"/>
+            </w:pPr>
+          </w:p>
+          <w:p/>
+          <w:p>
+            <w:r>
+              <w:t>SLS:</w:t>
+            </w:r>
+          </w:p>
+        </w:tc>
+      </w:tr>
+    </w:tbl>
+    <w:p>
+      <w:pPr>
+        <w:pStyle w:val="Heading1"/>
+        <w:ind w:left="0"/>
+      </w:pPr>
+      <w:r>
         <w:t>Memo Mode Transfers</w:t>
       </w:r>
     </w:p>
@@ -505,6 +778,7 @@
         <w:t xml:space="preserve">There are a few things to consider when determining </w:t>
       </w:r>
       <w:bookmarkStart w:id="0" w:name="_Int_EGvCkWLT"/>
+      <w:proofErr w:type="gramStart"/>
       <w:r>
         <w:rPr>
           <w:color w:val="000000" w:themeColor="text1"/>
@@ -518,6 +792,7 @@
         <w:t xml:space="preserve"> or not</w:t>
       </w:r>
       <w:bookmarkEnd w:id="0"/>
+      <w:proofErr w:type="gramEnd"/>
       <w:r>
         <w:rPr>
           <w:color w:val="000000" w:themeColor="text1"/>
@@ -921,6 +1196,7 @@
           </w:tcPr>
           <w:p>
             <w:r>
+              <w:lastRenderedPageBreak/>
               <w:t>Error Display Message</w:t>
             </w:r>
           </w:p>
@@ -1062,26 +1338,12 @@
         </w:tc>
       </w:tr>
     </w:tbl>
-    <w:p>
-      <w:pPr>
-        <w:pStyle w:val="NoSpacing"/>
-      </w:pPr>
-      <w:r>
-        <w:t xml:space="preserve"> </w:t>
-      </w:r>
-    </w:p>
-    <w:p>
-      <w:pPr>
-        <w:pStyle w:val="NoSpacing"/>
-      </w:pPr>
-    </w:p>
     <w:p>
       <w:pPr>
         <w:pStyle w:val="Heading1"/>
         <w:ind w:left="0"/>
       </w:pPr>
       <w:r>
-        <w:lastRenderedPageBreak/>
         <w:t>Account Exclusions</w:t>
       </w:r>
     </w:p>
@@ -1290,7 +1552,13 @@
           </w:tcPr>
           <w:p>
             <w:r>
-              <w:t>Ineligible Account Warning Codes</w:t>
+              <w:t>Ineligible</w:t>
+            </w:r>
+            <w:r>
+              <w:t xml:space="preserve"> Donor</w:t>
+            </w:r>
+            <w:r>
+              <w:t xml:space="preserve"> Account Warning Codes</w:t>
             </w:r>
           </w:p>
         </w:tc>
@@ -1312,10 +1580,13 @@
               <w:t xml:space="preserve"> to</w:t>
             </w:r>
             <w:r>
+              <w:t xml:space="preserve"> send funds</w:t>
+            </w:r>
+            <w:r>
               <w:t xml:space="preserve"> us</w:t>
             </w:r>
             <w:r>
-              <w:t>e</w:t>
+              <w:t>ing</w:t>
             </w:r>
             <w:r>
               <w:t xml:space="preserve"> this functionality. </w:t>
@@ -1338,12 +1609,24 @@
               <w:t>Valid Values:</w:t>
             </w:r>
             <w:r>
-              <w:t xml:space="preserve"> 0-999 or Blank</w:t>
-            </w:r>
-          </w:p>
-          <w:p>
-            <w:r>
-              <w:t>Blank = nothing to exclude</w:t>
+              <w:t xml:space="preserve"> </w:t>
+            </w:r>
+            <w:r>
+              <w:t>1</w:t>
+            </w:r>
+            <w:r>
+              <w:t xml:space="preserve">-999 or </w:t>
+            </w:r>
+            <w:r>
+              <w:t>NONE</w:t>
+            </w:r>
+          </w:p>
+          <w:p>
+            <w:r>
+              <w:t>None</w:t>
+            </w:r>
+            <w:r>
+              <w:t xml:space="preserve"> = nothing to exclude</w:t>
             </w:r>
           </w:p>
         </w:tc>
@@ -1369,6 +1652,96 @@
           <w:p>
             <w:r>
               <w:t>IAW:</w:t>
+            </w:r>
+          </w:p>
+        </w:tc>
+      </w:tr>
+      <w:tr>
+        <w:tc>
+          <w:tcPr>
+            <w:tcW w:w="2029" w:type="dxa"/>
+          </w:tcPr>
+          <w:p>
+            <w:r>
+              <w:t>Ineligible Recipient Account Warning Codes</w:t>
+            </w:r>
+          </w:p>
+        </w:tc>
+        <w:tc>
+          <w:tcPr>
+            <w:tcW w:w="5550" w:type="dxa"/>
+          </w:tcPr>
+          <w:p>
+            <w:r>
+              <w:t xml:space="preserve">Enter a list containing only numeric values along with commas or dashes. Any account with one of the Account level warning codes in the list will not be allowed to </w:t>
+            </w:r>
+            <w:r>
+              <w:t xml:space="preserve">receive funds </w:t>
+            </w:r>
+            <w:r>
+              <w:t>using this functionality.</w:t>
+            </w:r>
+          </w:p>
+          <w:p>
+            <w:pPr>
+              <w:rPr>
+                <w:sz w:val="16"/>
+                <w:szCs w:val="16"/>
+              </w:rPr>
+            </w:pPr>
+          </w:p>
+          <w:p>
+            <w:r>
+              <w:rPr>
+                <w:b/>
+                <w:bCs/>
+              </w:rPr>
+              <w:t>Valid Values:</w:t>
+            </w:r>
+            <w:r>
+              <w:t xml:space="preserve"> </w:t>
+            </w:r>
+            <w:r>
+              <w:t>1</w:t>
+            </w:r>
+            <w:r>
+              <w:t xml:space="preserve">-999 or </w:t>
+            </w:r>
+            <w:r>
+              <w:t>NONE</w:t>
+            </w:r>
+          </w:p>
+          <w:p>
+            <w:r>
+              <w:t>None</w:t>
+            </w:r>
+            <w:r>
+              <w:t xml:space="preserve"> = nothing to exclude</w:t>
+            </w:r>
+          </w:p>
+        </w:tc>
+        <w:tc>
+          <w:tcPr>
+            <w:tcW w:w="1560" w:type="dxa"/>
+            <w:vAlign w:val="center"/>
+          </w:tcPr>
+          <w:p>
+            <w:pPr>
+              <w:jc w:val="center"/>
+            </w:pPr>
+            <w:r>
+              <w:t>IRAW: NONE</w:t>
+            </w:r>
+          </w:p>
+        </w:tc>
+        <w:tc>
+          <w:tcPr>
+            <w:tcW w:w="1651" w:type="dxa"/>
+            <w:vAlign w:val="center"/>
+          </w:tcPr>
+          <w:p>
+            <w:r>
+              <w:t>IRAW:</w:t>
             </w:r>
           </w:p>
         </w:tc>
@@ -1869,6 +2242,18 @@
       </w:r>
       <w:r>
         <w:t xml:space="preserve">. </w:t>
+      </w:r>
+      <w:r>
+        <w:br/>
+      </w:r>
+      <w:r>
+        <w:br/>
+      </w:r>
+      <w:r>
+        <w:br/>
+      </w:r>
+      <w:r>
+        <w:br/>
       </w:r>
     </w:p>
     <w:tbl>
@@ -1901,6 +2286,7 @@
                 <w:b/>
                 <w:bCs/>
               </w:rPr>
+              <w:lastRenderedPageBreak/>
               <w:t>Parameter Name</w:t>
             </w:r>
           </w:p>
@@ -2345,16 +2731,6 @@
         </w:tc>
       </w:tr>
     </w:tbl>
-    <w:p>
-      <w:pPr>
-        <w:pStyle w:val="NoSpacing"/>
-      </w:pPr>
-    </w:p>
-    <w:p>
-      <w:pPr>
-        <w:pStyle w:val="NoSpacing"/>
-      </w:pPr>
-    </w:p>
     <w:p>
       <w:pPr>
         <w:pStyle w:val="Heading1"/>
@@ -2362,7 +2738,6 @@
         <w:ind w:left="0"/>
       </w:pPr>
       <w:r>
-        <w:lastRenderedPageBreak/>
         <w:t>Eligible ‘Transfer From’ Shares</w:t>
       </w:r>
     </w:p>
@@ -2642,6 +3017,7 @@
       </w:r>
     </w:p>
     <w:p>
+      <w:proofErr w:type="gramStart"/>
       <w:r>
         <w:t xml:space="preserve">Manually </w:t>
       </w:r>
@@ -2649,7 +3025,11 @@
         <w:t>c</w:t>
       </w:r>
       <w:r>
-        <w:t xml:space="preserve">reated </w:t>
+        <w:t>reated</w:t>
+      </w:r>
+      <w:proofErr w:type="gramEnd"/>
+      <w:r>
+        <w:t xml:space="preserve"> </w:t>
       </w:r>
       <w:r>
         <w:t>t</w:t>
@@ -2658,13 +3038,22 @@
         <w:t xml:space="preserve">ransfers are </w:t>
       </w:r>
       <w:r>
+        <w:t xml:space="preserve">Share </w:t>
+      </w:r>
+      <w:r>
         <w:t>T</w:t>
       </w:r>
       <w:r>
         <w:t>ransfer</w:t>
       </w:r>
       <w:r>
-        <w:t xml:space="preserve"> records added in Symitar Account Manager by CU staff. </w:t>
+        <w:t xml:space="preserve"> </w:t>
+      </w:r>
+      <w:r>
+        <w:t xml:space="preserve">Type 3 </w:t>
+      </w:r>
+      <w:r>
+        <w:t xml:space="preserve">records added in Symitar Account Manager by CU staff. </w:t>
       </w:r>
     </w:p>
     <w:tbl>
@@ -2785,16 +3174,25 @@
           </w:tcPr>
           <w:p>
             <w:r>
-              <w:t xml:space="preserve">Determine if the program will allow the member to edit manually created </w:t>
-            </w:r>
-            <w:r>
-              <w:t>T</w:t>
-            </w:r>
-            <w:r>
-              <w:t>ransfer</w:t>
-            </w:r>
-            <w:r>
-              <w:t xml:space="preserve"> records. </w:t>
+              <w:t>Determine if the program will allow the member to edit manually created</w:t>
+            </w:r>
+            <w:r>
+              <w:t xml:space="preserve"> Share Transfer Type 3 </w:t>
+            </w:r>
+            <w:r>
+              <w:t xml:space="preserve">records. </w:t>
+            </w:r>
+            <w:r>
+              <w:t xml:space="preserve">Listing specific user numbers </w:t>
+            </w:r>
+            <w:r>
+              <w:t xml:space="preserve">will only allow the user to edit transfer records created by that user, in addition to </w:t>
+            </w:r>
+            <w:r>
+              <w:t>those created by this program.</w:t>
+            </w:r>
+            <w:r>
+              <w:t xml:space="preserve"> </w:t>
             </w:r>
           </w:p>
           <w:p>
@@ -2814,7 +3212,27 @@
               <w:t>Valid Values:</w:t>
             </w:r>
             <w:r>
-              <w:t xml:space="preserve"> TRUE or FALSE</w:t>
+              <w:t xml:space="preserve"> </w:t>
+            </w:r>
+            <w:proofErr w:type="gramStart"/>
+            <w:r>
+              <w:t xml:space="preserve">TRUE </w:t>
+            </w:r>
+            <w:r>
+              <w:t>,</w:t>
+            </w:r>
+            <w:proofErr w:type="gramEnd"/>
+            <w:r>
+              <w:t xml:space="preserve"> </w:t>
+            </w:r>
+            <w:r>
+              <w:t>FALSE</w:t>
+            </w:r>
+            <w:r>
+              <w:t>, or 1-</w:t>
+            </w:r>
+            <w:r>
+              <w:t>9999</w:t>
             </w:r>
           </w:p>
         </w:tc>
@@ -2827,9 +3245,11 @@
             <w:pPr>
               <w:jc w:val="center"/>
             </w:pPr>
+            <w:proofErr w:type="gramStart"/>
             <w:r>
               <w:t>AE:FALSE</w:t>
             </w:r>
+            <w:proofErr w:type="gramEnd"/>
           </w:p>
         </w:tc>
         <w:tc>
@@ -2847,10 +3267,6 @@
     </w:tbl>
     <w:p>
       <w:pPr>
-        <w:keepNext/>
-        <w:keepLines/>
-        <w:spacing w:before="240" w:after="0"/>
-        <w:outlineLvl w:val="0"/>
         <w:rPr>
           <w:rFonts w:asciiTheme="majorHAnsi" w:eastAsiaTheme="majorEastAsia" w:hAnsiTheme="majorHAnsi" w:cstheme="majorBidi"/>
           <w:color w:val="2F5496" w:themeColor="accent1" w:themeShade="BF"/>
@@ -2858,6 +3274,15 @@
           <w:szCs w:val="32"/>
         </w:rPr>
       </w:pPr>
+      <w:r>
+        <w:rPr>
+          <w:rFonts w:asciiTheme="majorHAnsi" w:eastAsiaTheme="majorEastAsia" w:hAnsiTheme="majorHAnsi" w:cstheme="majorBidi"/>
+          <w:color w:val="2F5496" w:themeColor="accent1" w:themeShade="BF"/>
+          <w:sz w:val="32"/>
+          <w:szCs w:val="32"/>
+        </w:rPr>
+        <w:br/>
+      </w:r>
       <w:r>
         <w:rPr>
           <w:rFonts w:asciiTheme="majorHAnsi" w:eastAsiaTheme="majorEastAsia" w:hAnsiTheme="majorHAnsi" w:cstheme="majorBidi"/>
@@ -3053,6 +3478,7 @@
           </w:tcPr>
           <w:p>
             <w:r>
+              <w:lastRenderedPageBreak/>
               <w:t>Allow Transfers to Certificates</w:t>
             </w:r>
           </w:p>
@@ -3383,19 +3809,7 @@
         <w:pStyle w:val="Heading1"/>
         <w:ind w:firstLine="630"/>
       </w:pPr>
-    </w:p>
-    <w:p>
-      <w:pPr>
-        <w:pStyle w:val="NoSpacing"/>
-      </w:pPr>
-    </w:p>
-    <w:p>
-      <w:pPr>
-        <w:pStyle w:val="Heading1"/>
-        <w:ind w:firstLine="630"/>
-      </w:pPr>
-      <w:r>
-        <w:lastRenderedPageBreak/>
+      <w:r>
         <w:t>Overriding U</w:t>
       </w:r>
       <w:r>
@@ -3458,7 +3872,13 @@
         <w:t xml:space="preserve">. </w:t>
       </w:r>
       <w:r>
-        <w:t xml:space="preserve">These are the labels that explain what the user would enter in the Member Name or Share/ Loan ID fields. </w:t>
+        <w:t>These are the labels that explain what the user would enter</w:t>
+      </w:r>
+      <w:r>
+        <w:t xml:space="preserve"> </w:t>
+      </w:r>
+      <w:r>
+        <w:t xml:space="preserve">in the Member Name or Share/ Loan ID fields. </w:t>
       </w:r>
     </w:p>
     <w:p>
@@ -3467,9 +3887,9 @@
           <w:noProof/>
         </w:rPr>
         <w:drawing>
-          <wp:inline distT="0" distB="0" distL="0" distR="0" wp14:anchorId="618D8F7F" wp14:editId="6D0EF2B6">
-            <wp:extent cx="4183317" cy="4176979"/>
-            <wp:effectExtent l="0" t="0" r="8255" b="0"/>
+          <wp:inline distT="0" distB="0" distL="0" distR="0" wp14:anchorId="618D8F7F" wp14:editId="77E2EC2C">
+            <wp:extent cx="3632434" cy="3626931"/>
+            <wp:effectExtent l="0" t="0" r="6350" b="0"/>
             <wp:docPr id="1159923746" name="Picture 1" descr="A screenshot of a member&#10;&#10;AI-generated content may be incorrect."/>
             <wp:cNvGraphicFramePr>
               <a:graphicFrameLocks xmlns:a="http://schemas.openxmlformats.org/drawingml/2006/main" noChangeAspect="1"/>
@@ -3490,7 +3910,7 @@
                   <pic:spPr>
                     <a:xfrm>
                       <a:off x="0" y="0"/>
-                      <a:ext cx="4188999" cy="4182653"/>
+                      <a:ext cx="3643157" cy="3637637"/>
                     </a:xfrm>
                     <a:prstGeom prst="rect">
                       <a:avLst/>
@@ -3501,6 +3921,9 @@
             </a:graphic>
           </wp:inline>
         </w:drawing>
+      </w:r>
+      <w:r>
+        <w:br/>
       </w:r>
     </w:p>
     <w:tbl>
@@ -3647,6 +4070,14 @@
             </w:pPr>
           </w:p>
           <w:p>
+            <w:pPr>
+              <w:rPr>
+                <w:b/>
+                <w:bCs/>
+              </w:rPr>
+            </w:pPr>
+          </w:p>
+          <w:p>
             <w:r>
               <w:rPr>
                 <w:b/>
@@ -3704,6 +4135,19 @@
               <w:t xml:space="preserve">LBLMN: First 3 letters of last name (or business name) </w:t>
             </w:r>
           </w:p>
+          <w:p>
+            <w:pPr>
+              <w:jc w:val="center"/>
+            </w:pPr>
+          </w:p>
+          <w:p>
+            <w:pPr>
+              <w:jc w:val="center"/>
+            </w:pPr>
+            <w:r>
+              <w:t>LBLMN_SP: CU to provide Spanish text to display</w:t>
+            </w:r>
+          </w:p>
         </w:tc>
         <w:tc>
           <w:tcPr>
@@ -3713,6 +4157,14 @@
           <w:p>
             <w:r>
               <w:t>LBLMN:</w:t>
+            </w:r>
+          </w:p>
+          <w:p/>
+          <w:p/>
+          <w:p/>
+          <w:p>
+            <w:r>
+              <w:t>LBLMN_SP:</w:t>
             </w:r>
           </w:p>
         </w:tc>
@@ -3727,6 +4179,7 @@
           </w:tcPr>
           <w:p>
             <w:r>
+              <w:lastRenderedPageBreak/>
               <w:t>Label ID Sub-Title</w:t>
             </w:r>
           </w:p>
@@ -3815,6 +4268,19 @@
               <w:t xml:space="preserve">2-digit/ 4-digit ID without the S or L </w:t>
             </w:r>
           </w:p>
+          <w:p>
+            <w:pPr>
+              <w:jc w:val="center"/>
+            </w:pPr>
+          </w:p>
+          <w:p>
+            <w:pPr>
+              <w:jc w:val="center"/>
+            </w:pPr>
+            <w:r>
+              <w:t>LBLID_SP: CU to provide Spanish text to display.</w:t>
+            </w:r>
+          </w:p>
         </w:tc>
         <w:tc>
           <w:tcPr>
@@ -3824,6 +4290,13 @@
           <w:p>
             <w:r>
               <w:t>LBLID:</w:t>
+            </w:r>
+          </w:p>
+          <w:p/>
+          <w:p/>
+          <w:p>
+            <w:r>
+              <w:t>LBLID_SP:</w:t>
             </w:r>
           </w:p>
         </w:tc>
@@ -3831,18 +4304,444 @@
     </w:tbl>
     <w:p>
       <w:pPr>
-        <w:pStyle w:val="NoSpacing"/>
+        <w:pStyle w:val="Heading1"/>
+        <w:ind w:left="0"/>
       </w:pPr>
+      <w:r>
+        <w:t>Member Verify</w:t>
+      </w:r>
     </w:p>
     <w:p>
-      <w:pPr>
-        <w:pStyle w:val="NoSpacing"/>
-      </w:pPr>
+      <w:r>
+        <w:t>This verification occurs when a user enters a</w:t>
+      </w:r>
+      <w:r>
+        <w:t xml:space="preserve">nother member’s account information to validate </w:t>
+      </w:r>
+      <w:r>
+        <w:t>before initiating a transfer.</w:t>
+      </w:r>
+      <w:r>
+        <w:t xml:space="preserve"> </w:t>
+      </w:r>
+      <w:r>
+        <w:t>The settings below will help monitor and limit repeated failed verification attempts, reducing the risk of unauthorized access attempts or excessive guessing of member information.</w:t>
+      </w:r>
     </w:p>
+    <w:tbl>
+      <w:tblPr>
+        <w:tblStyle w:val="TableGrid"/>
+        <w:tblW w:w="0" w:type="auto"/>
+        <w:tblLook w:val="04A0" w:firstRow="1" w:lastRow="0" w:firstColumn="1" w:lastColumn="0" w:noHBand="0" w:noVBand="1"/>
+      </w:tblPr>
+      <w:tblGrid>
+        <w:gridCol w:w="2697"/>
+        <w:gridCol w:w="3508"/>
+        <w:gridCol w:w="2070"/>
+        <w:gridCol w:w="2515"/>
+      </w:tblGrid>
+      <w:tr>
+        <w:tc>
+          <w:tcPr>
+            <w:tcW w:w="2697" w:type="dxa"/>
+          </w:tcPr>
+          <w:p>
+            <w:pPr>
+              <w:rPr>
+                <w:b/>
+                <w:bCs/>
+              </w:rPr>
+            </w:pPr>
+            <w:r>
+              <w:rPr>
+                <w:b/>
+                <w:bCs/>
+              </w:rPr>
+              <w:t>Parameter Name</w:t>
+            </w:r>
+          </w:p>
+        </w:tc>
+        <w:tc>
+          <w:tcPr>
+            <w:tcW w:w="3508" w:type="dxa"/>
+          </w:tcPr>
+          <w:p>
+            <w:pPr>
+              <w:rPr>
+                <w:b/>
+                <w:bCs/>
+              </w:rPr>
+            </w:pPr>
+            <w:r>
+              <w:rPr>
+                <w:b/>
+                <w:bCs/>
+              </w:rPr>
+              <w:t>Description</w:t>
+            </w:r>
+          </w:p>
+        </w:tc>
+        <w:tc>
+          <w:tcPr>
+            <w:tcW w:w="2070" w:type="dxa"/>
+          </w:tcPr>
+          <w:p>
+            <w:pPr>
+              <w:jc w:val="center"/>
+              <w:rPr>
+                <w:b/>
+                <w:bCs/>
+              </w:rPr>
+            </w:pPr>
+            <w:r>
+              <w:rPr>
+                <w:b/>
+                <w:bCs/>
+              </w:rPr>
+              <w:t>Default Value</w:t>
+            </w:r>
+          </w:p>
+        </w:tc>
+        <w:tc>
+          <w:tcPr>
+            <w:tcW w:w="2515" w:type="dxa"/>
+          </w:tcPr>
+          <w:p>
+            <w:pPr>
+              <w:jc w:val="center"/>
+              <w:rPr>
+                <w:b/>
+                <w:bCs/>
+              </w:rPr>
+            </w:pPr>
+            <w:r>
+              <w:rPr>
+                <w:b/>
+                <w:bCs/>
+              </w:rPr>
+              <w:t>CU Response</w:t>
+            </w:r>
+          </w:p>
+        </w:tc>
+      </w:tr>
+      <w:tr>
+        <w:tc>
+          <w:tcPr>
+            <w:tcW w:w="2697" w:type="dxa"/>
+          </w:tcPr>
+          <w:p>
+            <w:r>
+              <w:t>Member Verify Account Tracking Type</w:t>
+            </w:r>
+          </w:p>
+        </w:tc>
+        <w:tc>
+          <w:tcPr>
+            <w:tcW w:w="3508" w:type="dxa"/>
+          </w:tcPr>
+          <w:p>
+            <w:r>
+              <w:t>This setting defines the Account Tracking Type that will be used to record invalid Member Verification attempts.</w:t>
+            </w:r>
+            <w:r>
+              <w:t xml:space="preserve"> </w:t>
+            </w:r>
+            <w:r>
+              <w:t>“0” will prevent invalid attempts from being recorded</w:t>
+            </w:r>
+            <w:r>
+              <w:t xml:space="preserve"> in the Tracking Record (not recommended).</w:t>
+            </w:r>
+          </w:p>
+          <w:p/>
+          <w:p>
+            <w:r>
+              <w:rPr>
+                <w:b/>
+                <w:bCs/>
+              </w:rPr>
+              <w:t>Valid Values:</w:t>
+            </w:r>
+            <w:r>
+              <w:t xml:space="preserve"> </w:t>
+            </w:r>
+            <w:r>
+              <w:t>0, 30-99</w:t>
+            </w:r>
+          </w:p>
+        </w:tc>
+        <w:tc>
+          <w:tcPr>
+            <w:tcW w:w="2070" w:type="dxa"/>
+          </w:tcPr>
+          <w:p>
+            <w:pPr>
+              <w:jc w:val="center"/>
+            </w:pPr>
+          </w:p>
+          <w:p>
+            <w:pPr>
+              <w:jc w:val="center"/>
+            </w:pPr>
+          </w:p>
+          <w:p>
+            <w:pPr>
+              <w:jc w:val="center"/>
+            </w:pPr>
+          </w:p>
+          <w:p>
+            <w:pPr>
+              <w:jc w:val="center"/>
+            </w:pPr>
+          </w:p>
+          <w:p>
+            <w:pPr>
+              <w:jc w:val="center"/>
+            </w:pPr>
+            <w:r>
+              <w:t>MVACTT:</w:t>
+            </w:r>
+            <w:r>
+              <w:t xml:space="preserve"> 0</w:t>
+            </w:r>
+          </w:p>
+        </w:tc>
+        <w:tc>
+          <w:tcPr>
+            <w:tcW w:w="2515" w:type="dxa"/>
+          </w:tcPr>
+          <w:p/>
+          <w:p/>
+          <w:p/>
+          <w:p/>
+          <w:p>
+            <w:r>
+              <w:t>MVACTT:</w:t>
+            </w:r>
+          </w:p>
+        </w:tc>
+      </w:tr>
+      <w:tr>
+        <w:tc>
+          <w:tcPr>
+            <w:tcW w:w="2697" w:type="dxa"/>
+          </w:tcPr>
+          <w:p>
+            <w:r>
+              <w:t>Max Member Verify Invalid Attempts</w:t>
+            </w:r>
+          </w:p>
+        </w:tc>
+        <w:tc>
+          <w:tcPr>
+            <w:tcW w:w="3508" w:type="dxa"/>
+          </w:tcPr>
+          <w:p>
+            <w:r>
+              <w:t xml:space="preserve">This setting controls the maximum number of failed Member Verification attempts allowed within a defined </w:t>
+            </w:r>
+            <w:proofErr w:type="gramStart"/>
+            <w:r>
+              <w:t>time period</w:t>
+            </w:r>
+            <w:proofErr w:type="gramEnd"/>
+            <w:r>
+              <w:t xml:space="preserve"> before Member Verification is temporarily blocked.</w:t>
+            </w:r>
+            <w:r>
+              <w:t xml:space="preserve"> “9999” will allow an unlimited number of attempts (not recommended).</w:t>
+            </w:r>
+          </w:p>
+          <w:p/>
+          <w:p>
+            <w:pPr>
+              <w:rPr>
+                <w:b/>
+                <w:bCs/>
+              </w:rPr>
+            </w:pPr>
+            <w:r>
+              <w:rPr>
+                <w:b/>
+                <w:bCs/>
+              </w:rPr>
+              <w:t>Valid Values:</w:t>
+            </w:r>
+            <w:r>
+              <w:rPr>
+                <w:b/>
+                <w:bCs/>
+              </w:rPr>
+              <w:t xml:space="preserve"> </w:t>
+            </w:r>
+            <w:r>
+              <w:t>0-20, 9999</w:t>
+            </w:r>
+          </w:p>
+        </w:tc>
+        <w:tc>
+          <w:tcPr>
+            <w:tcW w:w="2070" w:type="dxa"/>
+          </w:tcPr>
+          <w:p>
+            <w:pPr>
+              <w:jc w:val="center"/>
+            </w:pPr>
+          </w:p>
+          <w:p>
+            <w:pPr>
+              <w:jc w:val="center"/>
+            </w:pPr>
+          </w:p>
+          <w:p>
+            <w:pPr>
+              <w:jc w:val="center"/>
+            </w:pPr>
+          </w:p>
+          <w:p>
+            <w:pPr>
+              <w:jc w:val="center"/>
+            </w:pPr>
+          </w:p>
+          <w:p>
+            <w:pPr>
+              <w:jc w:val="center"/>
+            </w:pPr>
+          </w:p>
+          <w:p>
+            <w:pPr>
+              <w:jc w:val="center"/>
+            </w:pPr>
+            <w:r>
+              <w:t>MVMA: 6</w:t>
+            </w:r>
+          </w:p>
+        </w:tc>
+        <w:tc>
+          <w:tcPr>
+            <w:tcW w:w="2515" w:type="dxa"/>
+          </w:tcPr>
+          <w:p/>
+          <w:p/>
+          <w:p/>
+          <w:p/>
+          <w:p/>
+          <w:p>
+            <w:r>
+              <w:t>MVMA:</w:t>
+            </w:r>
+          </w:p>
+        </w:tc>
+      </w:tr>
+      <w:tr>
+        <w:tc>
+          <w:tcPr>
+            <w:tcW w:w="2697" w:type="dxa"/>
+          </w:tcPr>
+          <w:p>
+            <w:r>
+              <w:t>Member Verify Invalid Attempts Window</w:t>
+            </w:r>
+          </w:p>
+        </w:tc>
+        <w:tc>
+          <w:tcPr>
+            <w:tcW w:w="3508" w:type="dxa"/>
+          </w:tcPr>
+          <w:p>
+            <w:r>
+              <w:t>T</w:t>
+            </w:r>
+            <w:r>
+              <w:t xml:space="preserve">his setting defines the rolling </w:t>
+            </w:r>
+            <w:proofErr w:type="gramStart"/>
+            <w:r>
+              <w:t>time period</w:t>
+            </w:r>
+            <w:proofErr w:type="gramEnd"/>
+            <w:r>
+              <w:t xml:space="preserve">, in </w:t>
+            </w:r>
+            <w:proofErr w:type="gramStart"/>
+            <w:r>
+              <w:t>hours,</w:t>
+            </w:r>
+            <w:proofErr w:type="gramEnd"/>
+            <w:r>
+              <w:t xml:space="preserve"> used to evaluate failed Member Verification attempts.</w:t>
+            </w:r>
+          </w:p>
+          <w:p/>
+          <w:p>
+            <w:r>
+              <w:rPr>
+                <w:b/>
+                <w:bCs/>
+              </w:rPr>
+              <w:t>Valid Values:</w:t>
+            </w:r>
+            <w:r>
+              <w:t xml:space="preserve"> 1-48</w:t>
+            </w:r>
+          </w:p>
+        </w:tc>
+        <w:tc>
+          <w:tcPr>
+            <w:tcW w:w="2070" w:type="dxa"/>
+          </w:tcPr>
+          <w:p>
+            <w:pPr>
+              <w:jc w:val="center"/>
+            </w:pPr>
+          </w:p>
+          <w:p>
+            <w:pPr>
+              <w:jc w:val="center"/>
+            </w:pPr>
+          </w:p>
+          <w:p>
+            <w:pPr>
+              <w:jc w:val="center"/>
+            </w:pPr>
+            <w:r>
+              <w:t>MVIAW: 24</w:t>
+            </w:r>
+          </w:p>
+        </w:tc>
+        <w:tc>
+          <w:tcPr>
+            <w:tcW w:w="2515" w:type="dxa"/>
+          </w:tcPr>
+          <w:p/>
+          <w:p/>
+          <w:p>
+            <w:r>
+              <w:t>MVIAW:</w:t>
+            </w:r>
+          </w:p>
+        </w:tc>
+      </w:tr>
+    </w:tbl>
     <w:p>
-      <w:pPr>
-        <w:pStyle w:val="NoSpacing"/>
-      </w:pPr>
+      <w:r>
+        <w:br/>
+      </w:r>
+      <w:r>
+        <w:br/>
+      </w:r>
+      <w:r>
+        <w:br/>
+      </w:r>
+      <w:r>
+        <w:br/>
+      </w:r>
+      <w:r>
+        <w:br/>
+      </w:r>
+      <w:r>
+        <w:br/>
+      </w:r>
     </w:p>
     <w:p>
       <w:pPr>
@@ -3866,19 +4765,45 @@
       </w:pPr>
       <w:bookmarkStart w:id="2" w:name="_Hlk172545043"/>
       <w:r>
-        <w:t>The M</w:t>
+        <w:t xml:space="preserve">The </w:t>
+      </w:r>
+      <w:proofErr w:type="gramStart"/>
+      <w:r>
+        <w:t>M</w:t>
       </w:r>
       <w:r>
         <w:t>ember to Member</w:t>
       </w:r>
-      <w:r>
-        <w:t xml:space="preserve"> Transfers Report provides details about one-time immediate transfers, as well as future-dated and recurring transfers that have been scheduled by members using the M</w:t>
+      <w:proofErr w:type="gramEnd"/>
+      <w:r>
+        <w:t xml:space="preserve"> Transfers Report provides details about one-time immediate transfers, as well as future-dated and recurring transfers that have been scheduled by members using the </w:t>
+      </w:r>
+      <w:proofErr w:type="gramStart"/>
+      <w:r>
+        <w:t>M</w:t>
       </w:r>
       <w:r>
         <w:t>ember to Member</w:t>
       </w:r>
-      <w:r>
-        <w:t xml:space="preserve"> Transfers PowerOn. The report is generated by a batch PowerOn in Symitar. </w:t>
+      <w:proofErr w:type="gramEnd"/>
+      <w:r>
+        <w:t xml:space="preserve"> Transfers </w:t>
+      </w:r>
+      <w:proofErr w:type="spellStart"/>
+      <w:r>
+        <w:t>PowerOn</w:t>
+      </w:r>
+      <w:proofErr w:type="spellEnd"/>
+      <w:r>
+        <w:t xml:space="preserve">. The report is generated by a batch </w:t>
+      </w:r>
+      <w:proofErr w:type="spellStart"/>
+      <w:r>
+        <w:t>PowerOn</w:t>
+      </w:r>
+      <w:proofErr w:type="spellEnd"/>
+      <w:r>
+        <w:t xml:space="preserve"> in Symitar. </w:t>
       </w:r>
     </w:p>
     <w:bookmarkEnd w:id="2"/>
@@ -4048,8 +4973,13 @@
               <w:t>Valid Values:</w:t>
             </w:r>
             <w:r>
-              <w:t xml:space="preserve"> No or Yes</w:t>
-            </w:r>
+              <w:t xml:space="preserve"> No or </w:t>
+            </w:r>
+            <w:proofErr w:type="gramStart"/>
+            <w:r>
+              <w:t>Yes</w:t>
+            </w:r>
+            <w:proofErr w:type="gramEnd"/>
           </w:p>
         </w:tc>
         <w:tc>
@@ -4175,7 +5105,6 @@
         </w:tc>
       </w:tr>
     </w:tbl>
-    <w:p/>
     <w:p>
       <w:pPr>
         <w:pStyle w:val="Heading1"/>
@@ -4403,7 +5332,15 @@
           </w:tcPr>
           <w:p>
             <w:r>
-              <w:t>Is the CU currently LIVE to members with either Banno</w:t>
+              <w:t xml:space="preserve">Is the CU currently </w:t>
+            </w:r>
+            <w:proofErr w:type="gramStart"/>
+            <w:r>
+              <w:t>LIVE to members</w:t>
+            </w:r>
+            <w:proofErr w:type="gramEnd"/>
+            <w:r>
+              <w:t xml:space="preserve"> with either Banno</w:t>
             </w:r>
             <w:r>
               <w:t xml:space="preserve"> Online</w:t>
@@ -5779,21 +6716,6 @@
 </file>
 
 <file path=customXml/item1.xml><?xml version="1.0" encoding="utf-8"?>
-<b:Sources xmlns:b="http://schemas.openxmlformats.org/officeDocument/2006/bibliography" xmlns="http://schemas.openxmlformats.org/officeDocument/2006/bibliography" SelectedStyle="\APASixthEditionOfficeOnline.xsl" StyleName="APA" Version="6"/>
-</file>
-
-<file path=customXml/item2.xml><?xml version="1.0" encoding="utf-8"?>
-<p:properties xmlns:p="http://schemas.microsoft.com/office/2006/metadata/properties" xmlns:xsi="http://www.w3.org/2001/XMLSchema-instance" xmlns:pc="http://schemas.microsoft.com/office/infopath/2007/PartnerControls">
-  <documentManagement>
-    <lcf76f155ced4ddcb4097134ff3c332f xmlns="9ba05911-c24a-4853-8769-8a1374fe7448">
-      <Terms xmlns="http://schemas.microsoft.com/office/infopath/2007/PartnerControls"/>
-    </lcf76f155ced4ddcb4097134ff3c332f>
-    <TaxCatchAll xmlns="770a5452-f489-4b73-ab95-d08ebfacd134" xsi:nil="true"/>
-  </documentManagement>
-</p:properties>
-</file>
-
-<file path=customXml/item3.xml><?xml version="1.0" encoding="utf-8"?>
 <ct:contentTypeSchema xmlns:ct="http://schemas.microsoft.com/office/2006/metadata/contentType" xmlns:ma="http://schemas.microsoft.com/office/2006/metadata/properties/metaAttributes" ct:_="" ma:_="" ma:contentTypeName="Document" ma:contentTypeID="0x010100A77C9823173CF84797BEB05294A93705" ma:contentTypeVersion="15" ma:contentTypeDescription="Create a new document." ma:contentTypeScope="" ma:versionID="a06449ddb13fa6a6c0342e20d143ca9c">
   <xsd:schema xmlns:xsd="http://www.w3.org/2001/XMLSchema" xmlns:xs="http://www.w3.org/2001/XMLSchema" xmlns:p="http://schemas.microsoft.com/office/2006/metadata/properties" xmlns:ns2="9ba05911-c24a-4853-8769-8a1374fe7448" xmlns:ns3="0e06131f-2ce5-485c-956f-aae053c36232" xmlns:ns4="770a5452-f489-4b73-ab95-d08ebfacd134" targetNamespace="http://schemas.microsoft.com/office/2006/metadata/properties" ma:root="true" ma:fieldsID="988b7fcc47d8dbb21347a0fbf6618b13" ns2:_="" ns3:_="" ns4:_="">
     <xsd:import namespace="9ba05911-c24a-4853-8769-8a1374fe7448"/>
@@ -6017,7 +6939,7 @@
 </ct:contentTypeSchema>
 </file>
 
-<file path=customXml/item4.xml><?xml version="1.0" encoding="utf-8"?>
+<file path=customXml/item2.xml><?xml version="1.0" encoding="utf-8"?>
 <?mso-contentType ?>
 <FormTemplates xmlns="http://schemas.microsoft.com/sharepoint/v3/contenttype/forms">
   <Display>DocumentLibraryForm</Display>
@@ -6026,26 +6948,22 @@
 </FormTemplates>
 </file>
 
-<file path=customXml/itemProps1.xml><?xml version="1.0" encoding="utf-8"?>
-<ds:datastoreItem xmlns:ds="http://schemas.openxmlformats.org/officeDocument/2006/customXml" ds:itemID="{5006CFA3-1B74-4755-8E0B-6F88CC0BAACD}">
-  <ds:schemaRefs>
-    <ds:schemaRef ds:uri="http://schemas.openxmlformats.org/officeDocument/2006/bibliography"/>
-  </ds:schemaRefs>
-</ds:datastoreItem>
+<file path=customXml/item3.xml><?xml version="1.0" encoding="utf-8"?>
+<b:Sources xmlns:b="http://schemas.openxmlformats.org/officeDocument/2006/bibliography" xmlns="http://schemas.openxmlformats.org/officeDocument/2006/bibliography" SelectedStyle="\APASixthEditionOfficeOnline.xsl" StyleName="APA" Version="6"/>
 </file>
 
-<file path=customXml/itemProps2.xml><?xml version="1.0" encoding="utf-8"?>
-<ds:datastoreItem xmlns:ds="http://schemas.openxmlformats.org/officeDocument/2006/customXml" ds:itemID="{A0AE4F2E-17AC-4D38-BD6F-B007E7F4DC47}">
-  <ds:schemaRefs>
-    <ds:schemaRef ds:uri="http://schemas.microsoft.com/office/2006/metadata/properties"/>
-    <ds:schemaRef ds:uri="http://schemas.microsoft.com/office/infopath/2007/PartnerControls"/>
-    <ds:schemaRef ds:uri="9ba05911-c24a-4853-8769-8a1374fe7448"/>
-    <ds:schemaRef ds:uri="770a5452-f489-4b73-ab95-d08ebfacd134"/>
-  </ds:schemaRefs>
-</ds:datastoreItem>
+<file path=customXml/item4.xml><?xml version="1.0" encoding="utf-8"?>
+<p:properties xmlns:p="http://schemas.microsoft.com/office/2006/metadata/properties" xmlns:xsi="http://www.w3.org/2001/XMLSchema-instance" xmlns:pc="http://schemas.microsoft.com/office/infopath/2007/PartnerControls">
+  <documentManagement>
+    <lcf76f155ced4ddcb4097134ff3c332f xmlns="9ba05911-c24a-4853-8769-8a1374fe7448">
+      <Terms xmlns="http://schemas.microsoft.com/office/infopath/2007/PartnerControls"/>
+    </lcf76f155ced4ddcb4097134ff3c332f>
+    <TaxCatchAll xmlns="770a5452-f489-4b73-ab95-d08ebfacd134" xsi:nil="true"/>
+  </documentManagement>
+</p:properties>
 </file>
 
-<file path=customXml/itemProps3.xml><?xml version="1.0" encoding="utf-8"?>
+<file path=customXml/itemProps1.xml><?xml version="1.0" encoding="utf-8"?>
 <ds:datastoreItem xmlns:ds="http://schemas.openxmlformats.org/officeDocument/2006/customXml" ds:itemID="{C7127CEA-9873-4F3F-9C1A-E8B3F1D8496E}">
   <ds:schemaRefs>
     <ds:schemaRef ds:uri="http://schemas.microsoft.com/office/2006/metadata/contentType"/>
@@ -6065,10 +6983,29 @@
 </ds:datastoreItem>
 </file>
 
-<file path=customXml/itemProps4.xml><?xml version="1.0" encoding="utf-8"?>
+<file path=customXml/itemProps2.xml><?xml version="1.0" encoding="utf-8"?>
 <ds:datastoreItem xmlns:ds="http://schemas.openxmlformats.org/officeDocument/2006/customXml" ds:itemID="{65BD55E8-81A3-42A4-89DC-516014481E1E}">
   <ds:schemaRefs>
     <ds:schemaRef ds:uri="http://schemas.microsoft.com/sharepoint/v3/contenttype/forms"/>
   </ds:schemaRefs>
 </ds:datastoreItem>
+</file>
+
+<file path=customXml/itemProps3.xml><?xml version="1.0" encoding="utf-8"?>
+<ds:datastoreItem xmlns:ds="http://schemas.openxmlformats.org/officeDocument/2006/customXml" ds:itemID="{5006CFA3-1B74-4755-8E0B-6F88CC0BAACD}">
+  <ds:schemaRefs>
+    <ds:schemaRef ds:uri="http://schemas.openxmlformats.org/officeDocument/2006/bibliography"/>
+  </ds:schemaRefs>
+</ds:datastoreItem>
+</file>
+
+<file path=customXml/itemProps4.xml><?xml version="1.0" encoding="utf-8"?>
+<ds:datastoreItem xmlns:ds="http://schemas.openxmlformats.org/officeDocument/2006/customXml" ds:itemID="{A0AE4F2E-17AC-4D38-BD6F-B007E7F4DC47}">
+  <ds:schemaRefs>
+    <ds:schemaRef ds:uri="http://schemas.microsoft.com/office/2006/metadata/properties"/>
+    <ds:schemaRef ds:uri="http://schemas.microsoft.com/office/infopath/2007/PartnerControls"/>
+    <ds:schemaRef ds:uri="9ba05911-c24a-4853-8769-8a1374fe7448"/>
+    <ds:schemaRef ds:uri="770a5452-f489-4b73-ab95-d08ebfacd134"/>
+  </ds:schemaRefs>
+</ds:datastoreItem>
 </file>
</xml_diff>